<commit_message>
Switch experiments to cahousing, fix classifier evaluation
- experiments on cahousing (SA = ocean_proximity): TDG vs TDG + distinct
  l = 2, 3 and entropy l = 2 for k = 2 ... 100, reject / retry / repair
  comparison, recursive (c, l)
- new privacy metric: share of records with the majority SA value of their EC
- classifier evaluation: numbers with minus sign or decimal point became 0,
  rows were matched with labels by position instead of ID, '*' now uses
  the mean of the attribute
- report, slides and README updated
</commit_message>
<xml_diff>
--- a/report/SPAI_Exercise1_2_TopDown_l-diversity_report.docx
+++ b/report/SPAI_Exercise1_2_TopDown_l-diversity_report.docx
@@ -54,7 +54,7 @@
         <w:rPr>
           <w:i w:val="0"/>
         </w:rPr>
-        <w:t>k-anonymity [3] guarantees that every record shares its quasi-identifier (QI) values with at least k-1 other records, so a person cannot be linked to a single row. It does not say anything about the sensitive attribute (SA), though. If all records of an equivalence class (EC) have the same SA value, an attacker who knows the QIs of a person learns the sensitive value anyway (homogeneity attack). l-diversity [1] closes this gap by requiring that every EC contains at least l "well-represented" SA values.</w:t>
+        <w:t>k-anonymity [3] guarantees that every record shares its quasi-identifier (QI) values with at least k-1 other records, so a record cannot be linked to a single row. It says nothing about the sensitive attribute (SA), though. If all records of an equivalence class (EC) have the same SA value, an attacker who knows the QIs learns the sensitive value anyway (homogeneity attack). l-diversity [1] closes this gap by requiring that every EC contains at least l "well-represented" SA values.</w:t>
       </w:r>
     </w:p>
     <w:p>
@@ -62,7 +62,7 @@
         <w:rPr>
           <w:i w:val="0"/>
         </w:rPr>
-        <w:t>For this exercise we took the Top-Down Greedy (TDG) algorithm from the kaylode k-anonymity toolbox [4] and changed it so that it produces tables that are both k-anonymous and l-diverse. We then compared the modified algorithm with the original TDG on the Adult dataset. Already at k = 10 the original TDG leaves 4 ECs where all people have the same occupation and 45 ECs with fewer than 3 occupations; at k = 2 there are 1,046 homogeneous ECs covering 2,404 people.</w:t>
+        <w:t>We took the Top-Down Greedy (TDG) algorithm from the kaylode k-anonymity toolbox [4] and changed it so that it produces tables that are both k-anonymous and l-diverse. We compared it with the original TDG on the California Housing dataset (cahousing) of the toolbox, with ocean_proximity as SA. This dataset shows the problem very clearly, because the distance to the ocean follows almost directly from longitude and latitude: with the original TDG at k = 10, 687 ECs are homogeneous and they contain 10,192 of the 20,640 districts (49%); at k = 2 it is even 85%.</w:t>
       </w:r>
     </w:p>
     <w:p>
@@ -155,7 +155,7 @@
         <w:rPr>
           <w:i w:val="0"/>
         </w:rPr>
-        <w:t>The simplest version would be to reject a split as soon as one half is not l-diverse. Because TDG splits by QI distance only, this happens very often and the partitions stay large (see Section 4.3). So instead we try to repair the split, similar to the k-balancing that TDG already does:</w:t>
+        <w:t>Since TDG splits only by QI distance, one half of a split is often not l-diverse. There are three ways to handle this. Reject: keep the partition as one EC. Retry: draw a new random pair and split again, up to 10 times (this was our first version). Repair, which is what topdown_ldiv uses:</w:t>
       </w:r>
     </w:p>
     <w:p>
@@ -164,7 +164,7 @@
         <w:spacing w:after="20"/>
       </w:pPr>
       <w:r>
-        <w:t>Take the half that is not valid (the other one is valid, otherwise the split is rejected).</w:t>
+        <w:t>Take the half that is not valid (if both are invalid, the split is rejected).</w:t>
       </w:r>
     </w:p>
     <w:p>
@@ -182,7 +182,7 @@
         <w:spacing w:after="20"/>
       </w:pPr>
       <w:r>
-        <w:t>Go through them and move a record over only if the invalid half still needs records to reach k or the record improves its diversity (new SA value, higher entropy or larger recursive margin), and the valid half is still k-anonymous and l-diverse without it.</w:t>
+        <w:t>Move a record over only if the invalid half still needs records to reach k or the record improves its diversity (new SA value, higher entropy or larger recursive margin), and the valid half stays k-anonymous and l-diverse without it.</w:t>
       </w:r>
     </w:p>
     <w:p>
@@ -202,7 +202,7 @@
         <w:rPr>
           <w:i w:val="0"/>
         </w:rPr>
-        <w:t>Since we check at the start that the whole table is l-diverse and only valid partitions are ever created, every EC in the output fulfils k and l. With l = 0 the original k-balancing is used, so the plain topdown method behaves like before. Besides that we fixed the random seed of the pair heuristic (so runs are reproducible) and a global list that was not reset between runs. The new method is called topdown_ldiv and is started with, e.g., python anonymize.py --method=topdown_ldiv --k=10 --l=3 --ldiv=entropy --dataset=adult. Unit tests check on the Italia dataset that every EC has at least k records, is l-diverse and that no SA value was changed.</w:t>
+        <w:t>Since we check at the start that the whole table is l-diverse and only valid partitions are ever created, every EC in the output fulfils k and l. With l = 0 the original code path is used. We also fixed the random seed of the pair heuristic and a global list that was not reset between runs. The method is called with, e.g., python anonymize.py --method=topdown_ldiv --k=10 --l=2 --dataset=cahousing. Unit tests check that every EC has at least k records, is l-diverse and that no SA value was changed.</w:t>
       </w:r>
     </w:p>
     <w:p>
@@ -218,22 +218,7 @@
         <w:rPr>
           <w:i w:val="0"/>
         </w:rPr>
-        <w:t>We used the Adult dataset of the toolbox (30,162 records). QIs are sex, age, race, marital-status, education, native-country and workclass with the hierarchies from the toolbox. The SA is occupation with 14 values; the most frequent one (Prof-specialty) covers only 13.4% of the records, the rarest (Armed-Forces) 9 records. In the toolbox occupation was a QI, we removed it from the QIs for all methods so that the comparison is fair. We ran three experiments:</w:t>
-      </w:r>
-    </w:p>
-    <w:p>
-      <w:pPr>
-        <w:pStyle w:val="ListBullet"/>
-        <w:spacing w:after="20"/>
-      </w:pPr>
-      <w:r>
-        <w:rPr>
-          <w:b/>
-        </w:rPr>
-        <w:t>A:</w:t>
-      </w:r>
-      <w:r>
-        <w:t xml:space="preserve"> k = 10, l from 2 to 8 (distinct), 2 to 6 (entropy) and 2 to 4 (recursive, c = 2), compared with TDG at k = 10.</w:t>
+        <w:t>cahousing has 20,640 districts. The QIs are longitude, latitude, housing_median_age, median_income and median_house_value with the hierarchies from the toolbox. The SA ocean_proximity has only three values (4,953 / 9,136 / 6,551 records), so only l = 2 and 3 are possible, and entropy l = 3 is impossible (the whole table only reaches 2.91). In the toolbox this column is also the classification target, and we kept that. We ran three experiments:</w:t>
       </w:r>
     </w:p>
     <w:p>
@@ -248,7 +233,7 @@
         <w:t>B:</w:t>
       </w:r>
       <w:r>
-        <w:t xml:space="preserve"> l = 3 (distinct), k in {2, 3, 5, 10, 20, 50, 100} for both methods.</w:t>
+        <w:t xml:space="preserve"> k in {2, 3, 5, 10, 20, 50, 100} for the original TDG and for TDG with distinct l = 2, distinct l = 3 and entropy l = 2.</w:t>
       </w:r>
     </w:p>
     <w:p>
@@ -263,7 +248,22 @@
         <w:t>C:</w:t>
       </w:r>
       <w:r>
-        <w:t xml:space="preserve"> k = 10, l = 3 and 6, split repair switched off (split is just rejected).</w:t>
+        <w:t xml:space="preserve"> k = 2 and 10, distinct l = 2 and 3, with the three strategies reject, retry and repair.</w:t>
+      </w:r>
+    </w:p>
+    <w:p>
+      <w:pPr>
+        <w:pStyle w:val="ListBullet"/>
+        <w:spacing w:after="20"/>
+      </w:pPr>
+      <w:r>
+        <w:rPr>
+          <w:b/>
+        </w:rPr>
+        <w:t>R:</w:t>
+      </w:r>
+      <w:r>
+        <w:t xml:space="preserve"> recursive (c, l)-diversity with c = 2 and l = 2, 3 at k = 10.</w:t>
       </w:r>
     </w:p>
     <w:p>
@@ -271,7 +271,7 @@
         <w:rPr>
           <w:i w:val="0"/>
         </w:rPr>
-        <w:t>Information loss is measured with NCP, the discernibility metric (DM), the normalised average EC size (CAVG) and the number of ECs. For privacy we count homogeneous ECs (only one SA value) and ECs that violate 3-diversity. For classification we used the toolbox pipeline (based on [5]): KNN, SVM and Random Forest are trained on the anonymised training split (80%) to predict salary-class and evaluated with weighted F1 on the anonymised test split. Generalised values are replaced by the mean of the range or a one-hot encoding of all leaves. We had to fix some things in this evaluation: non-generalised values were dropped from the features, the F1 score ignored classes that were never predicted, the label order was random and the SVM had no feature scaling. All numbers below use the fixed version.</w:t>
+        <w:t>Information loss is measured with NCP, the discernibility metric (DM), the normalised average EC size (CAVG) and the number of ECs. For privacy we count homogeneous ECs and the records in them, and we measure how often an attacker is right who guesses the most frequent SA value of a person's EC ("majority share"). Without knowing any QI this guess is right for 44% of the districts. For classification we used the toolbox pipeline (based on [5]): KNN, SVM and Random Forest are trained on the anonymised training split (80%) to predict ocean_proximity and evaluated with weighted F1 on the anonymised test split. While doing this we found and fixed two bugs in the toolbox evaluation that only show up on cahousing: numeric values with a minus sign or a decimal point (e.g. -122.2) were replaced by 0, and the anonymised rows were matched with the labels by position instead of by ID, so features and labels belonged to different districts. Fully suppressed values (*) are now replaced by the mean of the attribute. KNN uses unscaled features as in the toolbox, which is why it is weak even on the original data.</w:t>
       </w:r>
     </w:p>
     <w:p>
@@ -299,7 +299,7 @@
           <w:i/>
           <w:sz w:val="18"/>
         </w:rPr>
-        <w:t>Table 1: Experiment B, original TDG vs. TDG with distinct 3-diversity for different k (Adult, SA = occupation).</w:t>
+        <w:t>Table 1: Experiment B. Homogeneous ECs of the original TDG and majority share (how often guessing the most frequent SA value of the EC is right) for all methods. TDG with l-diversity has no homogeneous EC in any run.</w:t>
       </w:r>
     </w:p>
     <w:tbl>
@@ -310,14 +310,13 @@
         <w:tblLook w:firstColumn="1" w:firstRow="1" w:lastColumn="0" w:lastRow="0" w:noHBand="0" w:noVBand="1" w:val="04A0"/>
       </w:tblPr>
       <w:tblGrid>
-        <w:gridCol w:w="1176"/>
-        <w:gridCol w:w="1176"/>
-        <w:gridCol w:w="1176"/>
-        <w:gridCol w:w="1176"/>
-        <w:gridCol w:w="1176"/>
-        <w:gridCol w:w="1176"/>
-        <w:gridCol w:w="1176"/>
-        <w:gridCol w:w="1176"/>
+        <w:gridCol w:w="1345"/>
+        <w:gridCol w:w="1345"/>
+        <w:gridCol w:w="1345"/>
+        <w:gridCol w:w="1345"/>
+        <w:gridCol w:w="1345"/>
+        <w:gridCol w:w="1345"/>
+        <w:gridCol w:w="1345"/>
       </w:tblGrid>
       <w:tr>
         <w:tc>
@@ -345,7 +344,7 @@
         </w:tc>
         <w:tc>
           <w:tcPr>
-            <w:tcW w:type="dxa" w:w="964"/>
+            <w:tcW w:type="dxa" w:w="1757"/>
             <w:shd w:val="clear" w:color="auto" w:fill="DCE3EC"/>
           </w:tcPr>
           <w:p>
@@ -363,13 +362,13 @@
                 <w:b/>
                 <w:sz w:val="18"/>
               </w:rPr>
-              <w:t>TDG ECs</w:t>
+              <w:t>TDG homog. / all ECs</w:t>
             </w:r>
           </w:p>
         </w:tc>
         <w:tc>
           <w:tcPr>
-            <w:tcW w:type="dxa" w:w="1701"/>
+            <w:tcW w:type="dxa" w:w="1474"/>
             <w:shd w:val="clear" w:color="auto" w:fill="DCE3EC"/>
           </w:tcPr>
           <w:p>
@@ -387,7 +386,7 @@
                 <w:b/>
                 <w:sz w:val="18"/>
               </w:rPr>
-              <w:t>homog. ECs (records)</w:t>
+              <w:t>TDG records in homog. ECs</w:t>
             </w:r>
           </w:p>
         </w:tc>
@@ -411,13 +410,13 @@
                 <w:b/>
                 <w:sz w:val="18"/>
               </w:rPr>
-              <w:t>ECs &lt; 3 values</w:t>
+              <w:t>TDG majority share</w:t>
             </w:r>
           </w:p>
         </w:tc>
         <w:tc>
           <w:tcPr>
-            <w:tcW w:type="dxa" w:w="964"/>
+            <w:tcW w:type="dxa" w:w="1134"/>
             <w:shd w:val="clear" w:color="auto" w:fill="DCE3EC"/>
           </w:tcPr>
           <w:p>
@@ -435,13 +434,13 @@
                 <w:b/>
                 <w:sz w:val="18"/>
               </w:rPr>
-              <w:t>TDG NCP</w:t>
+              <w:t>distinct l=2</w:t>
             </w:r>
           </w:p>
         </w:tc>
         <w:tc>
           <w:tcPr>
-            <w:tcW w:type="dxa" w:w="1077"/>
+            <w:tcW w:type="dxa" w:w="1134"/>
             <w:shd w:val="clear" w:color="auto" w:fill="DCE3EC"/>
           </w:tcPr>
           <w:p>
@@ -459,13 +458,13 @@
                 <w:b/>
                 <w:sz w:val="18"/>
               </w:rPr>
-              <w:t>TDG+l ECs</w:t>
+              <w:t>distinct l=3</w:t>
             </w:r>
           </w:p>
         </w:tc>
         <w:tc>
           <w:tcPr>
-            <w:tcW w:type="dxa" w:w="1020"/>
+            <w:tcW w:type="dxa" w:w="1134"/>
             <w:shd w:val="clear" w:color="auto" w:fill="DCE3EC"/>
           </w:tcPr>
           <w:p>
@@ -483,31 +482,7 @@
                 <w:b/>
                 <w:sz w:val="18"/>
               </w:rPr>
-              <w:t>violations</w:t>
-            </w:r>
-          </w:p>
-        </w:tc>
-        <w:tc>
-          <w:tcPr>
-            <w:tcW w:type="dxa" w:w="1077"/>
-            <w:shd w:val="clear" w:color="auto" w:fill="DCE3EC"/>
-          </w:tcPr>
-          <w:p>
-            <w:pPr>
-              <w:spacing w:after="0"/>
-              <w:jc w:val="center"/>
-            </w:pPr>
-            <w:r>
-              <w:rPr>
-                <w:sz w:val="18"/>
-              </w:rPr>
-            </w:r>
-            <w:r>
-              <w:rPr>
-                <w:b/>
-                <w:sz w:val="18"/>
-              </w:rPr>
-              <w:t>TDG+l NCP</w:t>
+              <w:t>entropy l=2</w:t>
             </w:r>
           </w:p>
         </w:tc>
@@ -531,7 +506,7 @@
         </w:tc>
         <w:tc>
           <w:tcPr>
-            <w:tcW w:type="dxa" w:w="964"/>
+            <w:tcW w:type="dxa" w:w="1757"/>
           </w:tcPr>
           <w:p>
             <w:pPr>
@@ -542,13 +517,13 @@
               <w:rPr>
                 <w:sz w:val="18"/>
               </w:rPr>
-              <w:t>6,587</w:t>
+              <w:t>7,356 / 8,554</w:t>
             </w:r>
           </w:p>
         </w:tc>
         <w:tc>
           <w:tcPr>
-            <w:tcW w:type="dxa" w:w="1701"/>
+            <w:tcW w:type="dxa" w:w="1474"/>
           </w:tcPr>
           <w:p>
             <w:pPr>
@@ -559,7 +534,7 @@
               <w:rPr>
                 <w:sz w:val="18"/>
               </w:rPr>
-              <w:t>1,046 (2,404)</w:t>
+              <w:t>85%</w:t>
             </w:r>
           </w:p>
         </w:tc>
@@ -576,13 +551,13 @@
               <w:rPr>
                 <w:sz w:val="18"/>
               </w:rPr>
-              <w:t>4,522</w:t>
+              <w:t>94%</w:t>
             </w:r>
           </w:p>
         </w:tc>
         <w:tc>
           <w:tcPr>
-            <w:tcW w:type="dxa" w:w="964"/>
+            <w:tcW w:type="dxa" w:w="1134"/>
           </w:tcPr>
           <w:p>
             <w:pPr>
@@ -593,13 +568,13 @@
               <w:rPr>
                 <w:sz w:val="18"/>
               </w:rPr>
-              <w:t>0.018</w:t>
+              <w:t>89%</w:t>
             </w:r>
           </w:p>
         </w:tc>
         <w:tc>
           <w:tcPr>
-            <w:tcW w:type="dxa" w:w="1077"/>
+            <w:tcW w:type="dxa" w:w="1134"/>
           </w:tcPr>
           <w:p>
             <w:pPr>
@@ -610,13 +585,13 @@
               <w:rPr>
                 <w:sz w:val="18"/>
               </w:rPr>
-              <w:t>3,866</w:t>
+              <w:t>82%</w:t>
             </w:r>
           </w:p>
         </w:tc>
         <w:tc>
           <w:tcPr>
-            <w:tcW w:type="dxa" w:w="1020"/>
+            <w:tcW w:type="dxa" w:w="1134"/>
           </w:tcPr>
           <w:p>
             <w:pPr>
@@ -627,24 +602,7 @@
               <w:rPr>
                 <w:sz w:val="18"/>
               </w:rPr>
-              <w:t>0</w:t>
-            </w:r>
-          </w:p>
-        </w:tc>
-        <w:tc>
-          <w:tcPr>
-            <w:tcW w:type="dxa" w:w="1077"/>
-          </w:tcPr>
-          <w:p>
-            <w:pPr>
-              <w:spacing w:after="0"/>
-              <w:jc w:val="center"/>
-            </w:pPr>
-            <w:r>
-              <w:rPr>
-                <w:sz w:val="18"/>
-              </w:rPr>
-              <w:t>0.045</w:t>
+              <w:t>61%</w:t>
             </w:r>
           </w:p>
         </w:tc>
@@ -668,7 +626,7 @@
         </w:tc>
         <w:tc>
           <w:tcPr>
-            <w:tcW w:type="dxa" w:w="964"/>
+            <w:tcW w:type="dxa" w:w="1757"/>
           </w:tcPr>
           <w:p>
             <w:pPr>
@@ -679,13 +637,13 @@
               <w:rPr>
                 <w:sz w:val="18"/>
               </w:rPr>
-              <w:t>4,730</w:t>
+              <w:t>3,841 / 5,015</w:t>
             </w:r>
           </w:p>
         </w:tc>
         <w:tc>
           <w:tcPr>
-            <w:tcW w:type="dxa" w:w="1701"/>
+            <w:tcW w:type="dxa" w:w="1474"/>
           </w:tcPr>
           <w:p>
             <w:pPr>
@@ -696,7 +654,7 @@
               <w:rPr>
                 <w:sz w:val="18"/>
               </w:rPr>
-              <w:t>298 (1,056)</w:t>
+              <w:t>75%</w:t>
             </w:r>
           </w:p>
         </w:tc>
@@ -713,13 +671,13 @@
               <w:rPr>
                 <w:sz w:val="18"/>
               </w:rPr>
-              <w:t>1,564</w:t>
+              <w:t>92%</w:t>
             </w:r>
           </w:p>
         </w:tc>
         <w:tc>
           <w:tcPr>
-            <w:tcW w:type="dxa" w:w="964"/>
+            <w:tcW w:type="dxa" w:w="1134"/>
           </w:tcPr>
           <w:p>
             <w:pPr>
@@ -730,13 +688,13 @@
               <w:rPr>
                 <w:sz w:val="18"/>
               </w:rPr>
-              <w:t>0.032</w:t>
+              <w:t>89%</w:t>
             </w:r>
           </w:p>
         </w:tc>
         <w:tc>
           <w:tcPr>
-            <w:tcW w:type="dxa" w:w="1077"/>
+            <w:tcW w:type="dxa" w:w="1134"/>
           </w:tcPr>
           <w:p>
             <w:pPr>
@@ -747,13 +705,13 @@
               <w:rPr>
                 <w:sz w:val="18"/>
               </w:rPr>
-              <w:t>3,800</w:t>
+              <w:t>81%</w:t>
             </w:r>
           </w:p>
         </w:tc>
         <w:tc>
           <w:tcPr>
-            <w:tcW w:type="dxa" w:w="1020"/>
+            <w:tcW w:type="dxa" w:w="1134"/>
           </w:tcPr>
           <w:p>
             <w:pPr>
@@ -764,24 +722,7 @@
               <w:rPr>
                 <w:sz w:val="18"/>
               </w:rPr>
-              <w:t>0</w:t>
-            </w:r>
-          </w:p>
-        </w:tc>
-        <w:tc>
-          <w:tcPr>
-            <w:tcW w:type="dxa" w:w="1077"/>
-          </w:tcPr>
-          <w:p>
-            <w:pPr>
-              <w:spacing w:after="0"/>
-              <w:jc w:val="center"/>
-            </w:pPr>
-            <w:r>
-              <w:rPr>
-                <w:sz w:val="18"/>
-              </w:rPr>
-              <w:t>0.043</w:t>
+              <w:t>61%</w:t>
             </w:r>
           </w:p>
         </w:tc>
@@ -805,7 +746,7 @@
         </w:tc>
         <w:tc>
           <w:tcPr>
-            <w:tcW w:type="dxa" w:w="964"/>
+            <w:tcW w:type="dxa" w:w="1757"/>
           </w:tcPr>
           <w:p>
             <w:pPr>
@@ -816,13 +757,13 @@
               <w:rPr>
                 <w:sz w:val="18"/>
               </w:rPr>
-              <w:t>3,145</w:t>
+              <w:t>1,778 / 2,740</w:t>
             </w:r>
           </w:p>
         </w:tc>
         <w:tc>
           <w:tcPr>
-            <w:tcW w:type="dxa" w:w="1701"/>
+            <w:tcW w:type="dxa" w:w="1474"/>
           </w:tcPr>
           <w:p>
             <w:pPr>
@@ -833,7 +774,7 @@
               <w:rPr>
                 <w:sz w:val="18"/>
               </w:rPr>
-              <w:t>70 (409)</w:t>
+              <w:t>63%</w:t>
             </w:r>
           </w:p>
         </w:tc>
@@ -850,13 +791,13 @@
               <w:rPr>
                 <w:sz w:val="18"/>
               </w:rPr>
-              <w:t>350</w:t>
+              <w:t>90%</w:t>
             </w:r>
           </w:p>
         </w:tc>
         <w:tc>
           <w:tcPr>
-            <w:tcW w:type="dxa" w:w="964"/>
+            <w:tcW w:type="dxa" w:w="1134"/>
           </w:tcPr>
           <w:p>
             <w:pPr>
@@ -867,13 +808,13 @@
               <w:rPr>
                 <w:sz w:val="18"/>
               </w:rPr>
-              <w:t>0.052</w:t>
+              <w:t>88%</w:t>
             </w:r>
           </w:p>
         </w:tc>
         <w:tc>
           <w:tcPr>
-            <w:tcW w:type="dxa" w:w="1077"/>
+            <w:tcW w:type="dxa" w:w="1134"/>
           </w:tcPr>
           <w:p>
             <w:pPr>
@@ -884,13 +825,13 @@
               <w:rPr>
                 <w:sz w:val="18"/>
               </w:rPr>
-              <w:t>2,978</w:t>
+              <w:t>80%</w:t>
             </w:r>
           </w:p>
         </w:tc>
         <w:tc>
           <w:tcPr>
-            <w:tcW w:type="dxa" w:w="1020"/>
+            <w:tcW w:type="dxa" w:w="1134"/>
           </w:tcPr>
           <w:p>
             <w:pPr>
@@ -901,24 +842,7 @@
               <w:rPr>
                 <w:sz w:val="18"/>
               </w:rPr>
-              <w:t>0</w:t>
-            </w:r>
-          </w:p>
-        </w:tc>
-        <w:tc>
-          <w:tcPr>
-            <w:tcW w:type="dxa" w:w="1077"/>
-          </w:tcPr>
-          <w:p>
-            <w:pPr>
-              <w:spacing w:after="0"/>
-              <w:jc w:val="center"/>
-            </w:pPr>
-            <w:r>
-              <w:rPr>
-                <w:sz w:val="18"/>
-              </w:rPr>
-              <w:t>0.055</w:t>
+              <w:t>62%</w:t>
             </w:r>
           </w:p>
         </w:tc>
@@ -942,7 +866,7 @@
         </w:tc>
         <w:tc>
           <w:tcPr>
-            <w:tcW w:type="dxa" w:w="964"/>
+            <w:tcW w:type="dxa" w:w="1757"/>
           </w:tcPr>
           <w:p>
             <w:pPr>
@@ -953,13 +877,13 @@
               <w:rPr>
                 <w:sz w:val="18"/>
               </w:rPr>
-              <w:t>1,784</w:t>
+              <w:t>687 / 1,385</w:t>
             </w:r>
           </w:p>
         </w:tc>
         <w:tc>
           <w:tcPr>
-            <w:tcW w:type="dxa" w:w="1701"/>
+            <w:tcW w:type="dxa" w:w="1474"/>
           </w:tcPr>
           <w:p>
             <w:pPr>
@@ -970,7 +894,7 @@
               <w:rPr>
                 <w:sz w:val="18"/>
               </w:rPr>
-              <w:t>4 (49)</w:t>
+              <w:t>49%</w:t>
             </w:r>
           </w:p>
         </w:tc>
@@ -987,13 +911,13 @@
               <w:rPr>
                 <w:sz w:val="18"/>
               </w:rPr>
-              <w:t>45</w:t>
+              <w:t>88%</w:t>
             </w:r>
           </w:p>
         </w:tc>
         <w:tc>
           <w:tcPr>
-            <w:tcW w:type="dxa" w:w="964"/>
+            <w:tcW w:type="dxa" w:w="1134"/>
           </w:tcPr>
           <w:p>
             <w:pPr>
@@ -1004,13 +928,13 @@
               <w:rPr>
                 <w:sz w:val="18"/>
               </w:rPr>
-              <w:t>0.091</w:t>
+              <w:t>87%</w:t>
             </w:r>
           </w:p>
         </w:tc>
         <w:tc>
           <w:tcPr>
-            <w:tcW w:type="dxa" w:w="1077"/>
+            <w:tcW w:type="dxa" w:w="1134"/>
           </w:tcPr>
           <w:p>
             <w:pPr>
@@ -1021,13 +945,13 @@
               <w:rPr>
                 <w:sz w:val="18"/>
               </w:rPr>
-              <w:t>1,758</w:t>
+              <w:t>81%</w:t>
             </w:r>
           </w:p>
         </w:tc>
         <w:tc>
           <w:tcPr>
-            <w:tcW w:type="dxa" w:w="1020"/>
+            <w:tcW w:type="dxa" w:w="1134"/>
           </w:tcPr>
           <w:p>
             <w:pPr>
@@ -1038,24 +962,7 @@
               <w:rPr>
                 <w:sz w:val="18"/>
               </w:rPr>
-              <w:t>0</w:t>
-            </w:r>
-          </w:p>
-        </w:tc>
-        <w:tc>
-          <w:tcPr>
-            <w:tcW w:type="dxa" w:w="1077"/>
-          </w:tcPr>
-          <w:p>
-            <w:pPr>
-              <w:spacing w:after="0"/>
-              <w:jc w:val="center"/>
-            </w:pPr>
-            <w:r>
-              <w:rPr>
-                <w:sz w:val="18"/>
-              </w:rPr>
-              <w:t>0.092</w:t>
+              <w:t>61%</w:t>
             </w:r>
           </w:p>
         </w:tc>
@@ -1079,7 +986,7 @@
         </w:tc>
         <w:tc>
           <w:tcPr>
-            <w:tcW w:type="dxa" w:w="964"/>
+            <w:tcW w:type="dxa" w:w="1757"/>
           </w:tcPr>
           <w:p>
             <w:pPr>
@@ -1090,13 +997,13 @@
               <w:rPr>
                 <w:sz w:val="18"/>
               </w:rPr>
-              <w:t>1,041</w:t>
+              <w:t>257 / 738</w:t>
             </w:r>
           </w:p>
         </w:tc>
         <w:tc>
           <w:tcPr>
-            <w:tcW w:type="dxa" w:w="1701"/>
+            <w:tcW w:type="dxa" w:w="1474"/>
           </w:tcPr>
           <w:p>
             <w:pPr>
@@ -1107,7 +1014,7 @@
               <w:rPr>
                 <w:sz w:val="18"/>
               </w:rPr>
-              <w:t>0 (0)</w:t>
+              <w:t>35%</w:t>
             </w:r>
           </w:p>
         </w:tc>
@@ -1124,13 +1031,13 @@
               <w:rPr>
                 <w:sz w:val="18"/>
               </w:rPr>
-              <w:t>1</w:t>
+              <w:t>85%</w:t>
             </w:r>
           </w:p>
         </w:tc>
         <w:tc>
           <w:tcPr>
-            <w:tcW w:type="dxa" w:w="964"/>
+            <w:tcW w:type="dxa" w:w="1134"/>
           </w:tcPr>
           <w:p>
             <w:pPr>
@@ -1141,13 +1048,13 @@
               <w:rPr>
                 <w:sz w:val="18"/>
               </w:rPr>
-              <w:t>0.142</w:t>
+              <w:t>85%</w:t>
             </w:r>
           </w:p>
         </w:tc>
         <w:tc>
           <w:tcPr>
-            <w:tcW w:type="dxa" w:w="1077"/>
+            <w:tcW w:type="dxa" w:w="1134"/>
           </w:tcPr>
           <w:p>
             <w:pPr>
@@ -1158,13 +1065,13 @@
               <w:rPr>
                 <w:sz w:val="18"/>
               </w:rPr>
-              <w:t>1,041</w:t>
+              <w:t>80%</w:t>
             </w:r>
           </w:p>
         </w:tc>
         <w:tc>
           <w:tcPr>
-            <w:tcW w:type="dxa" w:w="1020"/>
+            <w:tcW w:type="dxa" w:w="1134"/>
           </w:tcPr>
           <w:p>
             <w:pPr>
@@ -1175,24 +1082,7 @@
               <w:rPr>
                 <w:sz w:val="18"/>
               </w:rPr>
-              <w:t>0</w:t>
-            </w:r>
-          </w:p>
-        </w:tc>
-        <w:tc>
-          <w:tcPr>
-            <w:tcW w:type="dxa" w:w="1077"/>
-          </w:tcPr>
-          <w:p>
-            <w:pPr>
-              <w:spacing w:after="0"/>
-              <w:jc w:val="center"/>
-            </w:pPr>
-            <w:r>
-              <w:rPr>
-                <w:sz w:val="18"/>
-              </w:rPr>
-              <w:t>0.142</w:t>
+              <w:t>61%</w:t>
             </w:r>
           </w:p>
         </w:tc>
@@ -1216,7 +1106,7 @@
         </w:tc>
         <w:tc>
           <w:tcPr>
-            <w:tcW w:type="dxa" w:w="964"/>
+            <w:tcW w:type="dxa" w:w="1757"/>
           </w:tcPr>
           <w:p>
             <w:pPr>
@@ -1227,13 +1117,13 @@
               <w:rPr>
                 <w:sz w:val="18"/>
               </w:rPr>
-              <w:t>441</w:t>
+              <w:t>51 / 300</w:t>
             </w:r>
           </w:p>
         </w:tc>
         <w:tc>
           <w:tcPr>
-            <w:tcW w:type="dxa" w:w="1701"/>
+            <w:tcW w:type="dxa" w:w="1474"/>
           </w:tcPr>
           <w:p>
             <w:pPr>
@@ -1244,7 +1134,7 @@
               <w:rPr>
                 <w:sz w:val="18"/>
               </w:rPr>
-              <w:t>0 (0)</w:t>
+              <w:t>17%</w:t>
             </w:r>
           </w:p>
         </w:tc>
@@ -1261,13 +1151,13 @@
               <w:rPr>
                 <w:sz w:val="18"/>
               </w:rPr>
-              <w:t>0</w:t>
+              <w:t>81%</w:t>
             </w:r>
           </w:p>
         </w:tc>
         <w:tc>
           <w:tcPr>
-            <w:tcW w:type="dxa" w:w="964"/>
+            <w:tcW w:type="dxa" w:w="1134"/>
           </w:tcPr>
           <w:p>
             <w:pPr>
@@ -1278,13 +1168,13 @@
               <w:rPr>
                 <w:sz w:val="18"/>
               </w:rPr>
-              <w:t>0.251</w:t>
+              <w:t>80%</w:t>
             </w:r>
           </w:p>
         </w:tc>
         <w:tc>
           <w:tcPr>
-            <w:tcW w:type="dxa" w:w="1077"/>
+            <w:tcW w:type="dxa" w:w="1134"/>
           </w:tcPr>
           <w:p>
             <w:pPr>
@@ -1295,13 +1185,13 @@
               <w:rPr>
                 <w:sz w:val="18"/>
               </w:rPr>
-              <w:t>441</w:t>
+              <w:t>78%</w:t>
             </w:r>
           </w:p>
         </w:tc>
         <w:tc>
           <w:tcPr>
-            <w:tcW w:type="dxa" w:w="1020"/>
+            <w:tcW w:type="dxa" w:w="1134"/>
           </w:tcPr>
           <w:p>
             <w:pPr>
@@ -1312,24 +1202,7 @@
               <w:rPr>
                 <w:sz w:val="18"/>
               </w:rPr>
-              <w:t>0</w:t>
-            </w:r>
-          </w:p>
-        </w:tc>
-        <w:tc>
-          <w:tcPr>
-            <w:tcW w:type="dxa" w:w="1077"/>
-          </w:tcPr>
-          <w:p>
-            <w:pPr>
-              <w:spacing w:after="0"/>
-              <w:jc w:val="center"/>
-            </w:pPr>
-            <w:r>
-              <w:rPr>
-                <w:sz w:val="18"/>
-              </w:rPr>
-              <w:t>0.251</w:t>
+              <w:t>60%</w:t>
             </w:r>
           </w:p>
         </w:tc>
@@ -1353,7 +1226,7 @@
         </w:tc>
         <w:tc>
           <w:tcPr>
-            <w:tcW w:type="dxa" w:w="964"/>
+            <w:tcW w:type="dxa" w:w="1757"/>
           </w:tcPr>
           <w:p>
             <w:pPr>
@@ -1364,13 +1237,13 @@
               <w:rPr>
                 <w:sz w:val="18"/>
               </w:rPr>
-              <w:t>234</w:t>
+              <w:t>13 / 139</w:t>
             </w:r>
           </w:p>
         </w:tc>
         <w:tc>
           <w:tcPr>
-            <w:tcW w:type="dxa" w:w="1701"/>
+            <w:tcW w:type="dxa" w:w="1474"/>
           </w:tcPr>
           <w:p>
             <w:pPr>
@@ -1381,7 +1254,7 @@
               <w:rPr>
                 <w:sz w:val="18"/>
               </w:rPr>
-              <w:t>0 (0)</w:t>
+              <w:t>9%</w:t>
             </w:r>
           </w:p>
         </w:tc>
@@ -1398,13 +1271,13 @@
               <w:rPr>
                 <w:sz w:val="18"/>
               </w:rPr>
-              <w:t>0</w:t>
+              <w:t>77%</w:t>
             </w:r>
           </w:p>
         </w:tc>
         <w:tc>
           <w:tcPr>
-            <w:tcW w:type="dxa" w:w="964"/>
+            <w:tcW w:type="dxa" w:w="1134"/>
           </w:tcPr>
           <w:p>
             <w:pPr>
@@ -1415,13 +1288,13 @@
               <w:rPr>
                 <w:sz w:val="18"/>
               </w:rPr>
-              <w:t>0.373</w:t>
+              <w:t>76%</w:t>
             </w:r>
           </w:p>
         </w:tc>
         <w:tc>
           <w:tcPr>
-            <w:tcW w:type="dxa" w:w="1077"/>
+            <w:tcW w:type="dxa" w:w="1134"/>
           </w:tcPr>
           <w:p>
             <w:pPr>
@@ -1432,13 +1305,13 @@
               <w:rPr>
                 <w:sz w:val="18"/>
               </w:rPr>
-              <w:t>234</w:t>
+              <w:t>73%</w:t>
             </w:r>
           </w:p>
         </w:tc>
         <w:tc>
           <w:tcPr>
-            <w:tcW w:type="dxa" w:w="1020"/>
+            <w:tcW w:type="dxa" w:w="1134"/>
           </w:tcPr>
           <w:p>
             <w:pPr>
@@ -1449,24 +1322,7 @@
               <w:rPr>
                 <w:sz w:val="18"/>
               </w:rPr>
-              <w:t>0</w:t>
-            </w:r>
-          </w:p>
-        </w:tc>
-        <w:tc>
-          <w:tcPr>
-            <w:tcW w:type="dxa" w:w="1077"/>
-          </w:tcPr>
-          <w:p>
-            <w:pPr>
-              <w:spacing w:after="0"/>
-              <w:jc w:val="center"/>
-            </w:pPr>
-            <w:r>
-              <w:rPr>
-                <w:sz w:val="18"/>
-              </w:rPr>
-              <w:t>0.373</w:t>
+              <w:t>59%</w:t>
             </w:r>
           </w:p>
         </w:tc>
@@ -1482,15 +1338,7 @@
         <w:rPr>
           <w:i w:val="0"/>
         </w:rPr>
-        <w:t>Table 1 shows that the original TDG is clearly vulnerable for small k: at k = 2, 4,522 of 6,587 ECs have fewer than 3 occupations. The number goes down with larger k, but even at k = 20 there is still 1 EC with only 2 values. Only at k = 50 is the output 3-diverse "by accident", and then the NCP is 0.251. Our method reaches 3-diversity at k = 10 with an NCP of 0.092, so 2.7 times less information loss than increasing k. topdown_ldiv had zero violations in every run, for all three l-diversity types.</w:t>
-      </w:r>
-    </w:p>
-    <w:p>
-      <w:r>
-        <w:rPr>
-          <w:i w:val="0"/>
-        </w:rPr>
-        <w:t>The effect is easy to see on the small Italia dataset (SA = disease, k = 2, l = 3, see experiments/italia_demo_k2_l3.md): the original TDG creates 5 ECs where both people have the same disease, e.g. age 40~50 from Veneto with heart disease, and 35 of its 41 ECs have fewer than 3 diseases. With topdown_ldiv there are 20 ECs and all of them contain at least 3 different diseases.</w:t>
+        <w:t>The original TDG leaks a lot on this dataset (Table 1). Even at k = 100 there are still 13 homogeneous ECs with 1,776 districts. topdown_ldiv had zero homogeneous ECs and zero violations in every run. However, distinct l-diversity only removes certainty, not the inference: the ECs are often very skewed (in the k = 10, l = 2 run there are ECs with 393 districts of one value and 2 of another, see experiments/cahousing_demo_k10_l2.md), so the majority guess is still right for 89% (l = 2) and 82% (l = 3) of the districts at k = 2, compared with 94% for the original TDG. Only entropy l = 2 really brings it down to about 61%, close to the 44% an attacker gets without any QI.</w:t>
       </w:r>
     </w:p>
     <w:p>
@@ -1506,7 +1354,7 @@
         <w:rPr>
           <w:i w:val="0"/>
         </w:rPr>
-        <w:t>For small l the extra cost is almost zero (Figure 1): with distinct l = 3 the NCP goes from 0.091 to 0.092 and the number of ECs from 1,784 to 1,758. This is because occupation is quite evenly distributed, so most ECs already contain several values and only the few bad splits need repairing. From l = 6 on the cost grows faster (NCP 0.112 at l = 6, 0.163 at l = 8). Entropy l-diversity is stricter than distinct l-diversity with the same l, because a single dominant occupation is not allowed: entropy l = 5 (0.168) costs about as much as distinct l = 8 (0.163), and entropy l = 6 already gives NCP 0.268 with 678 ECs. Recursive diversity with c = 2, l = 3 costs 0.116, a bit more than entropy l = 3. CAVG follows the NCP, DM is noisier but shows the same trend. At k = 10 the original TDG took 27 s and topdown_ldiv between 19 and 41 s, at k = 2 it was 52 s vs. 69 s. These are single runs on a laptop and a second run gave quite different times (the anonymised tables themselves were identical), so we can only say that there is no large overhead. This is expected, since the repair only needs one extra pass over a partition when a split fails.</w:t>
+        <w:t>Figure 1 shows the price. Distinct l = 2 doubles the NCP at small k (0.155 -&gt; 0.319 at k = 2, 0.254 -&gt; 0.351 at k = 10), but the gap gets smaller with larger k (0.566 vs. 0.587 at k = 100). Compared at the same information loss, l-diversity is clearly the better deal: TDG with l = 2 at k = 2 has NCP 0.319 and no homogeneous EC, while the original TDG at k = 20 has a similar NCP (0.322) and still 7,255 districts in homogeneous ECs. Distinct l = 3 costs NCP 0.56 to 0.68 and entropy l = 2 about 0.80, with only 77 ECs at k = 10. Recursive diversity with c = 2 is even stricter: l = 2 gives NCP 0.864, and for l = 3 the whole table already fulfils the condition but no split can keep both halves valid, so everything stays in one EC (NCP 1.0).</w:t>
       </w:r>
     </w:p>
     <w:p>
@@ -1526,7 +1374,7 @@
               <a:graphicData uri="http://schemas.openxmlformats.org/drawingml/2006/picture">
                 <pic:pic>
                   <pic:nvPicPr>
-                    <pic:cNvPr id="0" name="adult_info_vs_l.png"/>
+                    <pic:cNvPr id="0" name="cahousing_info_vs_k.png"/>
                     <pic:cNvPicPr/>
                   </pic:nvPicPr>
                   <pic:blipFill>
@@ -1559,7 +1407,7 @@
           <w:i/>
           <w:sz w:val="18"/>
         </w:rPr>
-        <w:t>Figure 1: Experiment A (k = 10). NCP, number of ECs and CAVG for increasing l. The dotted line is the original TDG at k = 10.</w:t>
+        <w:t>Figure 1: Experiment B. NCP, number of ECs (log scale) and CAVG for different k.</w:t>
       </w:r>
     </w:p>
     <w:p>
@@ -1567,7 +1415,7 @@
         <w:pStyle w:val="Heading2"/>
       </w:pPr>
       <w:r>
-        <w:t>4.3  Why the repair step matters</w:t>
+        <w:t>4.3  Reject, retry or repair</w:t>
       </w:r>
     </w:p>
     <w:p>
@@ -1578,7 +1426,7 @@
       <w:r>
         <w:drawing>
           <wp:inline xmlns:a="http://schemas.openxmlformats.org/drawingml/2006/main" xmlns:pic="http://schemas.openxmlformats.org/drawingml/2006/picture">
-            <wp:extent cx="4500000" cy="1800000"/>
+            <wp:extent cx="4680000" cy="1768000"/>
             <wp:docPr id="2" name="Picture 2"/>
             <wp:cNvGraphicFramePr>
               <a:graphicFrameLocks noChangeAspect="1"/>
@@ -1587,7 +1435,7 @@
               <a:graphicData uri="http://schemas.openxmlformats.org/drawingml/2006/picture">
                 <pic:pic>
                   <pic:nvPicPr>
-                    <pic:cNvPr id="0" name="adult_repair.png"/>
+                    <pic:cNvPr id="0" name="cahousing_strategies.png"/>
                     <pic:cNvPicPr/>
                   </pic:nvPicPr>
                   <pic:blipFill>
@@ -1599,7 +1447,7 @@
                   <pic:spPr>
                     <a:xfrm>
                       <a:off x="0" y="0"/>
-                      <a:ext cx="4500000" cy="1800000"/>
+                      <a:ext cx="4680000" cy="1768000"/>
                     </a:xfrm>
                     <a:prstGeom prst="rect"/>
                   </pic:spPr>
@@ -1620,7 +1468,7 @@
           <w:i/>
           <w:sz w:val="18"/>
         </w:rPr>
-        <w:t>Figure 2: Experiment C (k = 10). Rejecting invalid splits vs. repairing them.</w:t>
+        <w:t>Figure 2: Experiment C. Handling of splits that are not l-diverse (distinct l-diversity).</w:t>
       </w:r>
     </w:p>
     <w:p>
@@ -1628,7 +1476,7 @@
         <w:rPr>
           <w:i w:val="0"/>
         </w:rPr>
-        <w:t>If invalid splits are just rejected, the NCP is 0.450 for l = 3 and 0.456 for l = 6, with only 354 and 298 ECs (Figure 2). With repair it is 0.092 and 0.112. The reason is that TDG decides splits only by QI distance, so already near the root one half is often missing some occupations. Rejecting the split there stops the recursion for a very large part of the table. Moving a handful of records with the missing SA values is enough to keep splitting.</w:t>
+        <w:t>Repairing the split gives the lowest information loss in all four settings (Figure 2): at k = 2, l = 2 the NCP is 0.469 with reject, 0.421 with retry and 0.319 with repair, at k = 10, l = 3 it is 0.714, 0.663 and 0.566. Retrying helps a bit, but a new random split has the same problem as the first one, because the SA is still not considered. Moving a few records with the missing values fixes exactly that. The repair also keeps the most ECs, which means its ECs are smaller and the majority share is a little higher (e.g. 81% vs. 79% for retry at k = 10, l = 3), but all of them fulfil the same l.</w:t>
       </w:r>
     </w:p>
     <w:p>
@@ -1656,7 +1504,7 @@
               <a:graphicData uri="http://schemas.openxmlformats.org/drawingml/2006/picture">
                 <pic:pic>
                   <pic:nvPicPr>
-                    <pic:cNvPr id="0" name="adult_ml_vs_l.png"/>
+                    <pic:cNvPr id="0" name="cahousing_ml_vs_k.png"/>
                     <pic:cNvPicPr/>
                   </pic:nvPicPr>
                   <pic:blipFill>
@@ -1689,7 +1537,7 @@
           <w:i/>
           <w:sz w:val="18"/>
         </w:rPr>
-        <w:t>Figure 3: Experiment A (k = 10). Weighted F1 on salary-class; grey = original data, dotted = original TDG.</w:t>
+        <w:t>Figure 3: Experiment B. Weighted F1 for predicting ocean_proximity; dashed = original data.</w:t>
       </w:r>
     </w:p>
     <w:p>
@@ -1697,7 +1545,7 @@
         <w:rPr>
           <w:i w:val="0"/>
         </w:rPr>
-        <w:t>On the original data the F1 scores are 0.762 / 0.823 / 0.814 (KNN / SVM / RF). The original TDG at k = 10 reaches 0.762 / 0.818 / 0.811, and with distinct l = 3 we get 0.763 / 0.816 / 0.811, which is the same within noise. Even in the strongest setting (entropy l = 6) the scores only drop to 0.751 / 0.807 / 0.803. Over all our runs topdown_ldiv was never more than 0.021 below the original data. Occupation itself is not used as a feature, and the few extra generalisations that the repair causes are spread over many ECs, so the classifiers barely notice them. In experiment B the largest F1 difference between the two methods at the same k was 0.013.</w:t>
+        <w:t>On the original data the F1 scores are 0.543 / 0.859 / 0.953 (KNN / SVM / RF), with the original TDG at k = 10 0.576 / 0.805 / 0.865. Distinct l = 2 costs little (0.562 / 0.803 / 0.850 at k = 10, never more than 0.027 below the original TDG at the same k). Distinct l = 3 (0.528 / 0.744 / 0.809) and especially entropy l = 2 (0.470 / 0.595 / 0.653) cost a lot. This is expected here, because the SA is also the class: l-diversity forces every EC to contain several classes, so the generalised QIs carry less information about the label. In other words, on this dataset protecting ocean_proximity and predicting it are directly in conflict.</w:t>
       </w:r>
     </w:p>
     <w:p>
@@ -1713,7 +1561,7 @@
         <w:rPr>
           <w:i w:val="0"/>
         </w:rPr>
-        <w:t>Adding l-diversity to TDG was mostly a question of where to put the check. Checking only at the end of a split is easy but wastes a lot of utility; repairing the split with records that bring in missing SA values keeps TDG's good information loss. On Adult, 3-diversity on top of 10-anonymity is practically free (NCP +0.001, same F1), while the original TDG needs k = 50 to get there. Higher l and entropy l-diversity become expensive quickly, so l should be chosen together with the SA distribution.</w:t>
+        <w:t>Adding l-diversity to TDG works: with our repair step every EC is k-anonymous and l-diverse, and the information loss is clearly lower than with rejecting or retrying invalid splits. On cahousing the SA is strongly connected to the QIs, so l-diversity is not cheap: distinct l = 2 roughly doubles the NCP at small k but still beats simply raising k. The more important lesson is that distinct l-diversity alone gives weak protection on such data: with only three SA values and very skewed ECs the majority guess is still right for most districts. Entropy l-diversity fixes this, but then the data loses most of its use for predicting ocean_proximity.</w:t>
       </w:r>
     </w:p>
     <w:p>
@@ -1721,7 +1569,7 @@
         <w:rPr>
           <w:i w:val="0"/>
         </w:rPr>
-        <w:t>Limitations: we only used one dataset and one SA, and occupation is relatively balanced, so on a skewed SA the cost would be higher. The repair is greedy and does not look for the best set of records. Distinct l-diversity does not protect against skewness or similarity attacks (e.g. three different but similar jobs); for this, t-closeness would be the next step. Finally, the whole table has to be l-diverse at the start, otherwise the algorithm stops with an error.</w:t>
+        <w:t>Limitations: one dataset with only three SA values, which is also the target. The repair is greedy and does not look for the best set of records. We did not measure runtime carefully (single runs took about 2 to 15 s on a laptop). For stronger protection against skewness and similarity attacks, t-closeness would be the next step.</w:t>
       </w:r>
     </w:p>
     <w:p>

</xml_diff>